<commit_message>
Strengthen abstract and reviewer transparency response
</commit_message>
<xml_diff>
--- a/deliverables/response_to_reviewers_r3.docx
+++ b/deliverables/response_to_reviewers_r3.docx
@@ -222,7 +222,7 @@
           <w:color w:val="1F4E79"/>
           <w:sz w:val="21"/>
         </w:rPr>
-        <w:t>We sincerely thank the Reviewer for the positive assessment and for recognizing the revisions made in the previous round. We have continued to improve the accompanying repository. The public main branch contains the complete data-processing code, versioned prompts, tool schemas and implementations, deterministic safety gate, ms-swift/Swift QLoRA training configuration and launchers, evaluation code, and non-sensitive reproducibility-record templates. The training data and trained model weights are not included. The repository is available at https://github.com/hangcao87/FractureAgent.</w:t>
+        <w:t>We sincerely thank the Reviewer for the positive assessment and for recognizing the revisions made in the previous round. We have continued to improve the accompanying repository. The public main branch contains the complete data-processing code, versioned prompts, tool schemas and implementations, deterministic safety gate, ms-swift/Swift QLoRA training configuration and launchers, evaluation code, synthetic fixtures and non-sensitive reproducibility-record templates. The curated training corpus and trained model weights are not included for the source-licence, ongoing-validation and intellectual-property reasons detailed in our response to Comment 4.2. The repository is available at https://github.com/hangcao87/FractureAgent.</w:t>
       </w:r>
     </w:p>
     <w:p>
@@ -301,7 +301,32 @@
           <w:color w:val="1F4E79"/>
           <w:sz w:val="21"/>
         </w:rPr>
-        <w:t>We agree with the Reviewer. We replaced the structured abstract with a single unstructured paragraph and shortened it while clarifying the argument flow: the clinical-support gap is stated first, followed by the proposed tool-augmented method, the essential training and evaluation design, the principal quantitative findings and the simulation-based limitation.</w:t>
+        <w:t>We agree with the Reviewer. The original abstract did not state the clinical-support gap and the design rationale sufficiently clearly. We replaced the four-part structured abstract with a single unstructured paragraph and reduced it from 461 to 195 words, within the journal's 200-word limit. The revision now follows a problem-gap-method-evidence-boundary sequence: it first explains why static digital guidance cannot coordinate changing rehabilitation needs, then shows how the five-tool ReAct architecture and deterministic safety gate address that gap, reports the principal quantitative findings and limits the conclusion to simulated technical feasibility. The complete revised abstract is reproduced below.</w:t>
+      </w:r>
+    </w:p>
+    <w:p>
+      <w:pPr>
+        <w:spacing w:before="40" w:after="180" w:line="252" w:lineRule="auto"/>
+        <w:ind w:left="317" w:right="317"/>
+      </w:pPr>
+      <w:r>
+        <w:rPr>
+          <w:rFonts w:ascii="Arial" w:hAnsi="Arial"/>
+          <w:b/>
+          <w:i w:val="0"/>
+          <w:color w:val="C00000"/>
+          <w:sz w:val="21"/>
+        </w:rPr>
+        <w:t xml:space="preserve">Revised abstract (complete text): </w:t>
+      </w:r>
+      <w:r>
+        <w:rPr>
+          <w:rFonts w:ascii="Arial" w:hAnsi="Arial"/>
+          <w:b w:val="0"/>
+          <w:i/>
+          <w:sz w:val="21"/>
+        </w:rPr>
+        <w:t>Fracture rehabilitation must adapt as pain, function and warning signs change across healing phases, but many digital tools provide static information and cannot coordinate exercise selection, symptom assessment, progress monitoring and safety escalation. To address this gap, we developed FractureAgent, a reasoning-and-action (ReAct)-style system that couples a domain-adapted Qwen3.5-9B backbone with five typed rehabilitation tools and a deterministic safety gate to provide phase-aware support. The model was adapted using quantized low-rank adaptation (QLoRA) supervised instruction tuning on 18,742 synthetic rehabilitation dialogues and tool-use traces derived from open-access clinical and patient-education sources. We evaluated FractureAgent using automated functional metrics, expert clinical ratings and 210 simulated-patient scenarios spanning six fracture types and three rehabilitation phases. It achieved a task completion rate of 91.4%, a mean clinical-appropriateness score of 4.21/5.00, pain-assessment concordance of 0.873, exercise-appropriateness of 0.896 and complication-detection sensitivity of 0.843, outperforming the evaluated baselines, including the unfine-tuned Qwen3.5-9B backbone. These findings indicate that FractureAgent can coordinate multiple rehabilitation tasks and provide adaptive support in simulated settings, addressing the technical limitations of static digital guidance; however, they do not establish clinical effectiveness or readiness for deployment.</w:t>
       </w:r>
     </w:p>
     <w:p>
@@ -376,7 +401,32 @@
           <w:color w:val="1F4E79"/>
           <w:sz w:val="21"/>
         </w:rPr>
-        <w:t>We agree that a dedicated statement is needed. We added a separate Code Availability paragraph under Declarations. The public repository contains the data-processing scripts, versioned training prompts, tool schemas and implementations, the deterministic safety gate, the ms-swift/Swift QLoRA configuration and launchers, evaluation code and non-sensitive run-record templates. The trained model weights, LoRA checkpoints, private credentials and the curated training corpus are not publicly released at this stage because they are being retained for ongoing research, intellectual-property protection and grant-related work. No patient-level data are distributed. Reasonable requests concerning derived data may be directed to hangcao87@163.com, subject to source licences, author approval and applicable institutional requirements.</w:t>
+        <w:t>We agree that the original manuscript did not make the release boundary sufficiently clear. We added a dedicated Code Availability paragraph under Declarations and revised related statements in the Introduction, Discussion and Conclusion for consistency. The public repository contains the data-processing code, versioned prompts, tool schemas and implementations, deterministic safety gate, ms-swift/Swift QLoRA configuration and launchers, evaluation code, synthetic fixtures and non-sensitive run-record templates. The curated training corpus is not redistributed because its source materials remain subject to the original providers' terms and the assembled corpus is being retained for ongoing research, intellectual-property protection and planned grant-supported work. The trained model weights and LoRA checkpoints are not released because follow-on validation and intellectual-property assessment remain ongoing and the resulting model is part of the same planned research programme. No patient-level data or private credentials are distributed. The complete statement added to the manuscript is reproduced below.</w:t>
+      </w:r>
+    </w:p>
+    <w:p>
+      <w:pPr>
+        <w:spacing w:before="40" w:after="180" w:line="252" w:lineRule="auto"/>
+        <w:ind w:left="317" w:right="317"/>
+      </w:pPr>
+      <w:r>
+        <w:rPr>
+          <w:rFonts w:ascii="Arial" w:hAnsi="Arial"/>
+          <w:b/>
+          <w:i w:val="0"/>
+          <w:color w:val="C00000"/>
+          <w:sz w:val="21"/>
+        </w:rPr>
+        <w:t xml:space="preserve">Revised Code Availability statement (complete text): </w:t>
+      </w:r>
+      <w:r>
+        <w:rPr>
+          <w:rFonts w:ascii="Arial" w:hAnsi="Arial"/>
+          <w:b w:val="0"/>
+          <w:i/>
+          <w:sz w:val="21"/>
+        </w:rPr>
+        <w:t>Code availability. The public repository at https://github.com/hangcao87/FractureAgent contains the data-processing scripts, versioned training prompts, tool schemas and implementations, deterministic safety gate, ms-swift/Swift QLoRA configuration and launchers, evaluation code, synthetic fixtures and non-sensitive run-record templates. The curated training corpus is not publicly distributed because the source materials remain subject to their original providers' terms and the assembled corpus is being retained for ongoing research, intellectual-property protection and planned grant-supported work. The trained FractureAgent weights and LoRA checkpoints are not publicly released because follow-on validation and intellectual-property assessment are ongoing and the resulting model forms part of the same planned research programme. No patient-level data or private credentials are included. Users may reproduce the disclosed workflow with a legally obtained local base model and their own authorized data; reasonable requests concerning derived data may be directed to hangcao87@163.com, subject to source licences, author approval and applicable institutional requirements.</w:t>
       </w:r>
     </w:p>
     <w:p>
@@ -401,7 +451,7 @@
           <w:color w:val="C00000"/>
           <w:sz w:val="21"/>
         </w:rPr>
-        <w:t>Declarations, Code availability; Availability of data and materials; Section 8, Conclusion.</w:t>
+        <w:t>Introduction, contribution summary; Discussion, Section 7.2; Conclusion, Section 8; Declarations, Availability of data and materials and Code availability.</w:t>
       </w:r>
     </w:p>
     <w:p>
@@ -439,7 +489,7 @@
           <w:i w:val="0"/>
           <w:sz w:val="21"/>
         </w:rPr>
-        <w:t>- Abstract: converted the structured Background/Methods/Results/Conclusions format into one unstructured paragraph.</w:t>
+        <w:t>- Abstract: converted the structured Background/Methods/Results/Conclusions format into a 195-word unstructured paragraph and reproduced the complete revision above.</w:t>
       </w:r>
     </w:p>
     <w:p>
@@ -453,7 +503,7 @@
           <w:i w:val="0"/>
           <w:sz w:val="21"/>
         </w:rPr>
-        <w:t>- Declarations: stated that the curated training corpus is not publicly distributed and added the derived-data request route.</w:t>
+        <w:t>- Declarations: stated separately why the curated training corpus and trained weights/checkpoints are not publicly distributed and added the derived-data request route.</w:t>
       </w:r>
     </w:p>
     <w:p>
@@ -468,6 +518,20 @@
           <w:sz w:val="21"/>
         </w:rPr>
         <w:t>- Declarations: added a dedicated Code Availability statement covering data processing, prompts, tools, Swift training, evaluation and run records.</w:t>
+      </w:r>
+    </w:p>
+    <w:p>
+      <w:pPr>
+        <w:spacing w:before="0" w:after="60" w:line="259" w:lineRule="auto"/>
+      </w:pPr>
+      <w:r>
+        <w:rPr>
+          <w:rFonts w:ascii="Arial" w:hAnsi="Arial"/>
+          <w:b w:val="0"/>
+          <w:i w:val="0"/>
+          <w:sz w:val="21"/>
+        </w:rPr>
+        <w:t>- Introduction and Discussion: removed ambiguous claims that the curated corpus was an open release or that the full model was reproducible from publicly released project weights and data.</w:t>
       </w:r>
     </w:p>
     <w:p>
@@ -496,31 +560,6 @@
           <w:sz w:val="21"/>
         </w:rPr>
         <w:t>- Repository: added Swift-only installation, data export, QLoRA SFT, inference, evaluation and run-record workflows; no training data or checkpoints were added.</w:t>
-      </w:r>
-    </w:p>
-    <w:p>
-      <w:pPr>
-        <w:spacing w:before="0" w:after="120" w:line="259" w:lineRule="auto"/>
-      </w:pPr>
-      <w:r>
-        <w:rPr>
-          <w:rFonts w:ascii="Arial" w:hAnsi="Arial"/>
-          <w:b/>
-          <w:i w:val="0"/>
-          <w:color w:val="1F4E79"/>
-          <w:sz w:val="21"/>
-        </w:rPr>
-        <w:t xml:space="preserve">Missing information / risk flags: </w:t>
-      </w:r>
-      <w:r>
-        <w:rPr>
-          <w:rFonts w:ascii="Arial" w:hAnsi="Arial"/>
-          <w:b w:val="0"/>
-          <w:i w:val="0"/>
-          <w:color w:val="1F4E79"/>
-          <w:sz w:val="21"/>
-        </w:rPr>
-        <w:t>None for the supplied comments. Before submission, confirm that the journal permits the stated access-request route and that the public branch contains the files listed above.</w:t>
       </w:r>
     </w:p>
     <w:p>

</xml_diff>